<commit_message>
Parlar Ioniano: kevyt webstack (HTML/CSS/JS + JSON + Bootstrap) esimerkkeineen, uusi kaksipalstainen layout, koontikortti ajan tasalle
Co-Authored-By: Claude Fable 5 <noreply@anthropic.com>
Claude-Session: https://claude.ai/code/session_01WLu7m3NNTZnXJVQ9kuPvzX
</commit_message>
<xml_diff>
--- a/parlar-ioniano/downloads/nayttosuunnitelma.docx
+++ b/parlar-ioniano/downloads/nayttosuunnitelma.docx
@@ -26,7 +26,7 @@
           <w:sz w:val="23"/>
           <w:szCs w:val="23"/>
         </w:rPr>
-        <w:t xml:space="preserve">Parlar Ioniano · Oman keksityn kielen esittelysivusto: React, datavetoiset kielioppitaulukot ja julkinen julkaisu · Viikot 36–49 · ei projektityötä viikoilla 41–43 (syysloma vko 42), luovutus pe 4.12.2026</w:t>
+        <w:t xml:space="preserve">Parlar Ioniano · Oman keksityn kielen esittelysivusto: käsin kirjoitettu HTML/CSS/JS, Bootstrap ja datavetoiset kielioppitaulukot · Viikot 36–49 · ei projektityötä viikoilla 41–43 (syysloma vko 42), luovutus pe 4.12.2026</w:t>
       </w:r>
     </w:p>
     <w:p>
@@ -65,7 +65,7 @@
           <w:sz w:val="21"/>
           <w:szCs w:val="21"/>
         </w:rPr>
-        <w:t xml:space="preserve">Näyttö suoritetaan oppilaitoksen webprojektina viikoilla 36–49/2026 (11 työviikkoa; viikoilla 41–43 ei projektityötä). Opiskelija suunnittelee, toteuttaa ja julkaisee React-sivuston, joka esittelee hänen itse luomansa kielen (Ionian / Lingua Ioniana). Tekniikka: React + Vite (JavaScript), valittu komponenttikirjasto, sisältö JSON-datana ajonaikaisella fetch-latauksella, työkaluketju ja yksikkötestit Nodella (Vitest), julkaisu GitHub Pagesiin. Koko projekti ja tuotos ovat englanniksi; arviointiasiakirjat suomeksi.</w:t>
+        <w:t xml:space="preserve">Näyttö suoritetaan oppilaitoksen webprojektina viikoilla 36–49/2026 (11 työviikkoa; viikoilla 41–43 ei projektityötä). Opiskelija suunnittelee, toteuttaa ja julkaisee staattisen verkkosivuston, joka esittelee hänen itse luomansa kielen (Ionian / Lingua Ioniana). Tekniikka: käsin kirjoitettu HTML ja CSS ilman käännösvaihetta tai bundleria, vanilla JavaScript ES-moduuleina, sisältö JSON-tiedostoina data-kansiossa ja ladattuna ajonaikaisella fetch-kutsulla, Bootstrap 5 komponenttikirjastona CDN:stä (versio kiinnitetty), yksikkötestit selaimessa avattavalla omalla testisivulla, julkaisu GitHub Pagesiin suoraan main-haarasta. Koko projekti ja tuotos ovat englanniksi; arviointiasiakirjat suomeksi.</w:t>
       </w:r>
     </w:p>
     <w:p>
@@ -103,7 +103,7 @@
           <w:sz w:val="21"/>
           <w:szCs w:val="21"/>
         </w:rPr>
-        <w:t xml:space="preserve">Pakollinen perusversio (P0): julkaistu sivusto, jossa Home, Alphabet &amp; Pronunciation, Pronouns, Nouns &amp; Articles, Numbers + itse rakennettu numeromuunnin ja Phrasebook; kaikki sisältö JSON-datasta; vähintään 12 testitapausta odotettuine tuloksineen ennen ajoa; 3 virheenkorjausketjua; katselmointi ja käyttäjätesti; v1.0 GitHub Pagesissa.</w:t>
+        <w:t xml:space="preserve">Pakollinen perusversio (P0): julkaistu sivusto, jossa Home, Alphabet &amp; Pronunciation, Pronouns, Nouns &amp; Articles, Numbers + itse rakennettu numeromuunnin (ilman Bootstrap-komponentteja) ja Phrasebook; kaikki sisältö JSON-datasta; vähintään 12 testitapausta odotettuine tuloksineen ennen ajoa; 3 virheenkorjausketjua; katselmointi ja käyttäjätesti; v1.0 GitHub Pagesissa.</w:t>
       </w:r>
     </w:p>
     <w:p>
@@ -553,7 +553,7 @@
                 <w:sz w:val="19"/>
                 <w:szCs w:val="19"/>
               </w:rPr>
-              <w:t xml:space="preserve">Kaksi kirjastoa + ei kirjastoa -vaihtoehto, omat mittaukset (bundle, Lighthouse), perusteltu päätös ja keskustelu kirjattu</w:t>
+              <w:t xml:space="preserve">Bootstrap + yksi muu kirjasto + ei kirjastoa -vaihtoehto, omat mittaukset (siirretty KB, Lighthouse), perusteltu päätös ja keskustelu kirjattu</w:t>
             </w:r>
           </w:p>
         </w:tc>
@@ -695,7 +695,7 @@
                 <w:sz w:val="19"/>
                 <w:szCs w:val="19"/>
               </w:rPr>
-              <w:t xml:space="preserve">Testaajan sanat erillään tulkinnasta, päätös jokaisesta havainnosta, backlog päivitetty, ketju 1/3 valmis, t12:n avoin asia käsitelty</w:t>
+              <w:t xml:space="preserve">Testaajan sanat erillään tulkinnasta, päätös jokaisesta havainnosta, backlog ajan tasalla, ketju 1/3 valmis, t12:n avoin asia käsitelty</w:t>
             </w:r>
           </w:p>
         </w:tc>
@@ -766,7 +766,7 @@
                 <w:sz w:val="19"/>
                 <w:szCs w:val="19"/>
               </w:rPr>
-              <w:t xml:space="preserve">Testimatriisi ajettu (≥12), ketjut 1–3 valmiit, Lighthouse ennen/jälkeen -parit, npm audit ja salaisuustarkistus</w:t>
+              <w:t xml:space="preserve">Testimatriisi ajettu (≥12), ketjut 1–3 valmiit, Lighthouse ennen/jälkeen -parit, HTML-validointi, CDN-riippuvuuksien tarkistus ja salaisuustarkistus</w:t>
             </w:r>
           </w:p>
         </w:tc>
@@ -956,7 +956,7 @@
           <w:bCs/>
           <w:color w:val="143e78"/>
         </w:rPr>
-        <w:t xml:space="preserve">Tieto- ja viestintätekniikan perustehtävät · 12 vaatimusta</w:t>
+        <w:t xml:space="preserve">Tieto- ja viestintätekniikan perustehtävät</w:t>
       </w:r>
     </w:p>
     <w:tbl>
@@ -1711,7 +1711,7 @@
                 <w:sz w:val="19"/>
                 <w:szCs w:val="19"/>
               </w:rPr>
-              <w:t xml:space="preserve">Kehitysympäristön pystytys: käyttöjärjestelmä, Node, VS Code, Git</w:t>
+              <w:t xml:space="preserve">Kehitysympäristön pystytys: käyttöjärjestelmä, VS Code, paikallinen web-palvelin, Git</w:t>
             </w:r>
           </w:p>
         </w:tc>
@@ -1784,7 +1784,7 @@
                 <w:sz w:val="19"/>
                 <w:szCs w:val="19"/>
               </w:rPr>
-              <w:t xml:space="preserve">Dev-palvelimen jako paikallisverkkoon ja testaus puhelimella; palomuuri- ja tietoturvahuomiot kirjattu</w:t>
+              <w:t xml:space="preserve">Paikallisen web-palvelimen jako lähiverkkoon ja testaus puhelimella; palomuuri- ja tietoturvahuomiot kirjattu</w:t>
             </w:r>
           </w:p>
         </w:tc>
@@ -1959,7 +1959,7 @@
           <w:bCs/>
           <w:color w:val="143e78"/>
         </w:rPr>
-        <w:t xml:space="preserve">Ohjelmointi · 11 vaatimusta</w:t>
+        <w:t xml:space="preserve">Ohjelmointi</w:t>
       </w:r>
     </w:p>
     <w:tbl>
@@ -2130,7 +2130,7 @@
                 <w:sz w:val="19"/>
                 <w:szCs w:val="19"/>
               </w:rPr>
-              <w:t xml:space="preserve">Vite + VS Code + ESLint käytössä; ensimmäinen build ja deploy</w:t>
+              <w:t xml:space="preserve">VS Code, Live Server ja selaimen kehittäjätyökalut käytössä; ensimmäinen commit ja deploy</w:t>
             </w:r>
           </w:p>
         </w:tc>
@@ -2276,7 +2276,7 @@
                 <w:sz w:val="19"/>
                 <w:szCs w:val="19"/>
               </w:rPr>
-              <w:t xml:space="preserve">Muuntimen yksikkötestit ja testimatriisin ajo tuloksineen</w:t>
+              <w:t xml:space="preserve">Muuntimen yksikkötestit selaimessa (tests/tests.html) ja testimatriisin ajo tuloksineen</w:t>
             </w:r>
           </w:p>
         </w:tc>
@@ -2349,7 +2349,7 @@
                 <w:sz w:val="19"/>
                 <w:szCs w:val="19"/>
               </w:rPr>
-              <w:t xml:space="preserve">Muuntimen puhtaat funktiot ja moduulijako (numbers.js)</w:t>
+              <w:t xml:space="preserve">Muuntimen puhtaat funktiot ja ES-moduulijako (js/numbers.js)</w:t>
             </w:r>
           </w:p>
         </w:tc>
@@ -2422,7 +2422,7 @@
                 <w:sz w:val="19"/>
                 <w:szCs w:val="19"/>
               </w:rPr>
-              <w:t xml:space="preserve">Refaktorointisarja testit vihreinä; nimeäminen ja ESLint</w:t>
+              <w:t xml:space="preserve">Refaktorointisarja testit vihreinä; nimeäminen ja HTML-validointi</w:t>
             </w:r>
           </w:p>
         </w:tc>
@@ -2495,7 +2495,7 @@
                 <w:sz w:val="19"/>
                 <w:szCs w:val="19"/>
               </w:rPr>
-              <w:t xml:space="preserve">Näkymät sivukartasta: Home, Alphabet, Pronouns, Nouns &amp; Articles</w:t>
+              <w:t xml:space="preserve">Sivut sivukartasta: Home, Alphabet, Pronouns, Nouns &amp; Articles</w:t>
             </w:r>
           </w:p>
         </w:tc>
@@ -2889,7 +2889,7 @@
           <w:bCs/>
           <w:color w:val="143e78"/>
         </w:rPr>
-        <w:t xml:space="preserve">Ohjelmistokehittäjänä toimiminen · 14 vaatimusta</w:t>
+        <w:t xml:space="preserve">Ohjelmistokehittäjänä toimiminen</w:t>
       </w:r>
     </w:p>
     <w:tbl>
@@ -3571,7 +3571,7 @@
                 <w:sz w:val="19"/>
                 <w:szCs w:val="19"/>
               </w:rPr>
-              <w:t xml:space="preserve">Tietovarastopäätös: JSON + ajonaikainen fetch, hylätyt vaihtoehdot perusteltu</w:t>
+              <w:t xml:space="preserve">Tietovarastopäätös: JSON-tiedostot data-kansiossa + ajonaikainen fetch, hylätyt vaihtoehdot perusteltu</w:t>
             </w:r>
           </w:p>
         </w:tc>
@@ -3790,7 +3790,7 @@
                 <w:sz w:val="19"/>
                 <w:szCs w:val="19"/>
               </w:rPr>
-              <w:t xml:space="preserve">XSS-turvallinen renderöinti todistettuna, riippuvuusaudit, ei salaisuuksia</w:t>
+              <w:t xml:space="preserve">XSS-turvallinen renderöinti (textContent) todistettuna, CDN-riippuvuuksien tarkistus, ei salaisuuksia</w:t>
             </w:r>
           </w:p>
         </w:tc>
@@ -4038,7 +4038,7 @@
           <w:bCs/>
           <w:color w:val="143e78"/>
         </w:rPr>
-        <w:t xml:space="preserve">Ohjelmiston toteuttaminen ohjelmistokomponenttikirjastolla · 7 vaatimusta</w:t>
+        <w:t xml:space="preserve">Ohjelmiston toteuttaminen ohjelmistokomponenttikirjastolla</w:t>
       </w:r>
     </w:p>
     <w:tbl>
@@ -4209,7 +4209,7 @@
                 <w:sz w:val="19"/>
                 <w:szCs w:val="19"/>
               </w:rPr>
-              <w:t xml:space="preserve">Kehittämisympäristön käyttöönotto ja kirjaston konfigurointi teemoineen</w:t>
+              <w:t xml:space="preserve">Kehittämisympäristön käyttöönotto sekä Bootstrapin käyttöönotto CDN:stä ja konfigurointi css/style.css:n muuttujaylikirjoituksilla</w:t>
             </w:r>
           </w:p>
         </w:tc>
@@ -4282,7 +4282,7 @@
                 <w:sz w:val="19"/>
                 <w:szCs w:val="19"/>
               </w:rPr>
-              <w:t xml:space="preserve">Vertailumuistio: mahdollisuudet ja rajoitteet omin mittauksin</w:t>
+              <w:t xml:space="preserve">Vertailumuistio: Bootstrapin mahdollisuudet ja rajoitteet omin mittauksin</w:t>
             </w:r>
           </w:p>
         </w:tc>
@@ -4355,7 +4355,7 @@
                 <w:sz w:val="19"/>
                 <w:szCs w:val="19"/>
               </w:rPr>
-              <w:t xml:space="preserve">Taulukot, välilehdet ja navigaatio kirjaston komponenteilla</w:t>
+              <w:t xml:space="preserve">Navbar, taulukot, välilehdet, accordion ja grid Bootstrapin komponenteilla</w:t>
             </w:r>
           </w:p>
         </w:tc>
@@ -4428,7 +4428,7 @@
                 <w:sz w:val="19"/>
                 <w:szCs w:val="19"/>
               </w:rPr>
-              <w:t xml:space="preserve">Ulkoiset komponentit npm:stä: kirjasto, ikonit, fontit</w:t>
+              <w:t xml:space="preserve">Ulkoiset komponentit CDN:stä: Bootstrap CSS ja JS versio kiinnitettynä, ikonit ja fontit</w:t>
             </w:r>
           </w:p>
         </w:tc>
@@ -4501,7 +4501,7 @@
                 <w:sz w:val="19"/>
                 <w:szCs w:val="19"/>
               </w:rPr>
-              <w:t xml:space="preserve">Näkymien suunnittelu, toteutus ja testaus kirjastoa käyttäen</w:t>
+              <w:t xml:space="preserve">Sivujen suunnittelu, toteutus ja testaus Bootstrapia käyttäen</w:t>
             </w:r>
           </w:p>
         </w:tc>
@@ -4855,7 +4855,7 @@
           <w:sz w:val="21"/>
           <w:szCs w:val="21"/>
         </w:rPr>
-        <w:t xml:space="preserve">Tekoäly on sallittu apuväline React-koodissa, virheilmoituksissa ja testi-ideoissa: ymmärrä → tarkista → testaa → kirjaa. Jokainen merkittävä käyttö kirjataan AI-lokiin aineistoviitteineen ja tietosuojavahvistuksineen.</w:t>
+        <w:t xml:space="preserve">Tekoäly on sallittu apuväline HTML:ssä, CSS:ssä ja JavaScriptissä, virheilmoituksissa ja testi-ideoissa: ymmärrä → tarkista → testaa → kirjaa. Jokainen merkittävä käyttö kirjataan AI-lokiin aineistoviitteineen ja tietosuojavahvistuksineen.</w:t>
       </w:r>
     </w:p>
     <w:p>
@@ -4935,7 +4935,7 @@
           <w:sz w:val="20"/>
           <w:szCs w:val="20"/>
         </w:rPr>
-        <w:t xml:space="preserve">src/, public/content/ (JSON-data), tests/, tools/ ja project-docs/</w:t>
+        <w:t xml:space="preserve">index.html ja sivut, css/, js/, data/ (JSON-data), tests/, tools/ ja project-docs/</w:t>
       </w:r>
     </w:p>
     <w:p>
@@ -4989,7 +4989,7 @@
           <w:sz w:val="20"/>
           <w:szCs w:val="20"/>
         </w:rPr>
-        <w:t xml:space="preserve">Testimatriisi tuloksineen, 3 virheenkorjausketjua, Lighthouse-parit, npm audit -kirjaus</w:t>
+        <w:t xml:space="preserve">Testimatriisi tuloksineen, 3 virheenkorjausketjua, Lighthouse-parit, HTML-validoinnin ja CDN-riippuvuuksien kirjaus</w:t>
       </w:r>
     </w:p>
     <w:p>
@@ -5179,7 +5179,7 @@
           <w:sz w:val="20"/>
           <w:szCs w:val="20"/>
         </w:rPr>
-        <w:t xml:space="preserve">Rajapintanäyte on Fetch API + JSON-datan käsittely (ryhmittely, suodatus, haku). Erillistä ulkoista REST-palvelua ei projektissa ole — jos arvioija edellyttää ulkoista rajapintaa, asia nostetaan esiin viikon 44 tarkistuspisteessä.</w:t>
+        <w:t xml:space="preserve">Rajapintanäyte on Fetch API + JSON-datan käsittely (ryhmittely, suodatus, haku) data-kansion tiedostoista. Erillistä ulkoista REST-palvelua ei projektissa ole — jos arvioija edellyttää ulkoista rajapintaa, asia nostetaan esiin viikon 44 tarkistuspisteessä.</w:t>
       </w:r>
     </w:p>
     <w:p>
@@ -5261,6 +5261,33 @@
           <w:szCs w:val="20"/>
         </w:rPr>
         <w:t xml:space="preserve">8–10 min: tuotos toiminnassa (muunnin, fraasihaku), yksi tekninen päätös perusteluineen, yksi virheenkorjausketju, Git-historia ja tarkistettu tekoälyn käyttö.</w:t>
+      </w:r>
+    </w:p>
+    <w:p>
+      <w:pPr>
+        <w:spacing w:after="20" w:before="0"/>
+      </w:pPr>
+      <w:r>
+        <w:rPr>
+          <w:b/>
+          <w:bCs/>
+          <w:sz w:val="21"/>
+          <w:szCs w:val="21"/>
+        </w:rPr>
+        <w:t xml:space="preserve">Kevyt teknologiavalinta</w:t>
+      </w:r>
+    </w:p>
+    <w:p>
+      <w:pPr>
+        <w:spacing w:after="140" w:before="0"/>
+      </w:pPr>
+      <w:r>
+        <w:rPr>
+          <w:color w:val="555555"/>
+          <w:sz w:val="20"/>
+          <w:szCs w:val="20"/>
+        </w:rPr>
+        <w:t xml:space="preserve">Projektissa ei ole käännösvaihetta eikä pakettienhallintaa: HTML, CSS ja JavaScript kirjoitetaan käsin ja Bootstrap tulee CDN:stä. Siksi 'build'-tyyppiset työnäytteet on korvattu kevytstack-vastineilla: sivun paino selaimen Network-paneelista, W3C-HTML-validointi, Lighthouse-parit ja CDN-riippuvuuksien tarkistus (versio kiinnitetty, integrity-tiiviste) npm auditin sijaan. Yksikkötestit ajetaan selaimessa tests/tests.html-sivulta ilman testikirjastoa.</w:t>
       </w:r>
     </w:p>
     <w:sectPr>

</xml_diff>